<commit_message>
Figures 7 and 8: legends below the panels, cleaner injury-study panel
Co-Authored-By: Claude Opus 5.5 <noreply@anthropic.com>
</commit_message>
<xml_diff>
--- a/docs/manuscrito/manuscript.docx
+++ b/docs/manuscrito/manuscript.docx
@@ -4467,7 +4467,7 @@
       <w:r>
         <w:drawing>
           <wp:inline>
-            <wp:extent cx="5334000" cy="2186515"/>
+            <wp:extent cx="5334000" cy="2680728"/>
             <wp:effectExtent b="0" l="0" r="0" t="0"/>
             <wp:docPr descr="Figure 7. Real-image validation. (a) MAE of each feature on real video at native resolution and downscaled to broadcast player sizes. (b) Digital twin: MAE predicted by simulating each recording with its own camera geometry versus MAE measured on the real images, for three 2D error models." title="" id="58" name="Picture"/>
             <a:graphic>
@@ -4488,7 +4488,7 @@
                   <pic:spPr bwMode="auto">
                     <a:xfrm>
                       <a:off x="0" y="0"/>
-                      <a:ext cx="5334000" cy="2186515"/>
+                      <a:ext cx="5334000" cy="2680728"/>
                     </a:xfrm>
                     <a:prstGeom prst="rect">
                       <a:avLst/>
@@ -4595,7 +4595,7 @@
       <w:r>
         <w:drawing>
           <wp:inline>
-            <wp:extent cx="5334000" cy="2001137"/>
+            <wp:extent cx="5334000" cy="2303210"/>
             <wp:effectExtent b="0" l="0" r="0" t="0"/>
             <wp:docPr descr="Figure 8. Swing-leg joint loads. (a) Laboratory peak hip-flexor moment versus peak kicking-ankle speed (construct validity). (b) Peak hip-flexor moment from broadcast-like video (80 px, 25 fps, replay views) versus the laboratory reference. (c) Injuries needed to detect a given hazard ratio per SD of true load as a function of the reliability λ of the measured score; horizontal lines: injuries accrued by the whole league in one season at two assumed incidences." title="" id="63" name="Picture"/>
             <a:graphic>
@@ -4616,7 +4616,7 @@
                   <pic:spPr bwMode="auto">
                     <a:xfrm>
                       <a:off x="0" y="0"/>
-                      <a:ext cx="5334000" cy="2001137"/>
+                      <a:ext cx="5334000" cy="2303210"/>
                     </a:xfrm>
                     <a:prstGeom prst="rect">
                       <a:avLst/>

</xml_diff>